<commit_message>
Popraw import i formularze projektu PSF
</commit_message>
<xml_diff>
--- a/public/wzory/PSF_A3_Umowa_wsparcia_szablon.docx
+++ b/public/wzory/PSF_A3_Umowa_wsparcia_szablon.docx
@@ -66,7 +66,7 @@
           <w:sz w:val="22"/>
           <w:szCs w:val="22"/>
         </w:rPr>
-        <w:t>Umowa wsparcia nr: _____/FELB.06.08/[rok]</w:t>
+        <w:t>Umowa wsparcia nr: {{nr_umowy}}</w:t>
       </w:r>
     </w:p>
     <w:p>
@@ -822,7 +822,7 @@
           <w:sz w:val="22"/>
           <w:szCs w:val="22"/>
         </w:rPr>
-        <w:t>Data: ___/___/______</w:t>
+        <w:t>Data: {{data_dokumentu}}</w:t>
       </w:r>
     </w:p>
     <w:p>

</xml_diff>

<commit_message>
Dopasuj uklad daty w umowie PSF A3
</commit_message>
<xml_diff>
--- a/public/wzory/PSF_A3_Umowa_wsparcia_szablon.docx
+++ b/public/wzory/PSF_A3_Umowa_wsparcia_szablon.docx
@@ -66,7 +66,7 @@
           <w:sz w:val="22"/>
           <w:szCs w:val="22"/>
         </w:rPr>
-        <w:t>Umowa wsparcia nr: {{nr_umowy}}</w:t>
+        <w:t>Umowa wsparcia nr: {{nr_umowy}} z dnia {{data_dokumentu}} r.</w:t>
       </w:r>
     </w:p>
     <w:p>
@@ -810,20 +810,6 @@
       <w:pPr>
         <w:spacing w:line="276" w:lineRule="auto"/>
       </w:pPr>
-    </w:p>
-    <w:p>
-      <w:pPr>
-        <w:spacing w:line="276" w:lineRule="auto"/>
-        <w:jc w:val="both"/>
-      </w:pPr>
-      <w:r>
-        <w:rPr>
-          <w:rFonts w:ascii="Arial" w:eastAsia="Arial" w:hAnsi="Arial" w:cs="Arial"/>
-          <w:sz w:val="22"/>
-          <w:szCs w:val="22"/>
-        </w:rPr>
-        <w:t>Data: {{data_dokumentu}}</w:t>
-      </w:r>
     </w:p>
     <w:p>
       <w:pPr>

</xml_diff>

<commit_message>
PSF A3: lamanie wierszy Operatorow; B/C1: kompresja ukladu podpisow (1 strona)
</commit_message>
<xml_diff>
--- a/public/wzory/PSF_A3_Umowa_wsparcia_szablon.docx
+++ b/public/wzory/PSF_A3_Umowa_wsparcia_szablon.docx
@@ -100,7 +100,13 @@
           <w:sz w:val="22"/>
           <w:szCs w:val="22"/>
         </w:rPr>
-        <w:t>Pomiędzy: ☐ Operatorem - Liderem projektu: Stowarzyszenie Pomocy Bliźniemu im. Brata Krystyna, ul. Słoneczna 63, 66-400 Gorzów Wlkp., NIP: 5992420801, reprezentowanym przez _________________________ ☒ Operatorem - Partnerem projektu: Stowarzyszenie na Rzecz Edukacji "Pomost", ul. Okrężna 3, 66-200 Świebodzin, NIP: 9271873207, reprezentowanym przez Dorotę Królikowską (zwanym dalej "Operatorem") a Uczestnikiem projektu: {{imie_nazwisko}}, PESEL: {{pesel}}, zamieszkałym w: {{adres}}, zwanym dalej "Uczestnikiem".</w:t>
+        <w:t>Pomiędzy:</w:t>
+        <w:br/>
+        <w:t xml:space="preserve">☐ Operatorem - Liderem projektu: Stowarzyszenie Pomocy Bliźniemu im. Brata Krystyna, ul. Słoneczna 63, 66-400 Gorzów Wlkp., NIP: 5992420801, reprezentowanym przez _________________________</w:t>
+        <w:br/>
+        <w:t xml:space="preserve">☒ Operatorem - Partnerem projektu: Stowarzyszenie na Rzecz Edukacji "Pomost", ul. Okrężna 3, 66-200 Świebodzin, NIP: 9271873207, reprezentowanym przez Dorotę Królikowską (zwanym dalej "Operatorem")</w:t>
+        <w:br/>
+        <w:t xml:space="preserve">a Uczestnikiem projektu: {{imie_nazwisko}}, PESEL: {{pesel}}, zamieszkałym w: {{adres}}, zwanym dalej "Uczestnikiem".</w:t>
       </w:r>
     </w:p>
     <w:p>

</xml_diff>